<commit_message>
technical documentation and ppt added
</commit_message>
<xml_diff>
--- a/Electricity_Load_Forecasting_Technical_Documentation_Formatted.docx
+++ b/Electricity_Load_Forecasting_Technical_Documentation_Formatted.docx
@@ -51,7 +51,65 @@
     <w:p>
       <w:pPr>
         <w:spacing w:before="400"/>
-      </w:pPr>
+        <w:jc w:val="center"/>
+        <w:rPr>
+          <w:i/>
+          <w:iCs/>
+        </w:rPr>
+      </w:pPr>
+      <w:r>
+        <w:rPr>
+          <w:i/>
+          <w:iCs/>
+        </w:rPr>
+        <w:t xml:space="preserve">Link to UI: </w:t>
+      </w:r>
+      <w:hyperlink r:id="rId7" w:history="1">
+        <w:r>
+          <w:rPr>
+            <w:rStyle w:val="Hyperlink"/>
+            <w:i/>
+            <w:iCs/>
+          </w:rPr>
+          <w:t>https://brocode-electricity-forecasting-648786197436.us-central1.run.app/</w:t>
+        </w:r>
+      </w:hyperlink>
+    </w:p>
+    <w:p>
+      <w:pPr>
+        <w:spacing w:before="400"/>
+        <w:jc w:val="center"/>
+        <w:rPr>
+          <w:i/>
+          <w:iCs/>
+        </w:rPr>
+      </w:pPr>
+      <w:proofErr w:type="spellStart"/>
+      <w:r>
+        <w:rPr>
+          <w:i/>
+          <w:iCs/>
+        </w:rPr>
+        <w:t>Github</w:t>
+      </w:r>
+      <w:proofErr w:type="spellEnd"/>
+      <w:r>
+        <w:rPr>
+          <w:i/>
+          <w:iCs/>
+        </w:rPr>
+        <w:t xml:space="preserve"> Link: </w:t>
+      </w:r>
+      <w:hyperlink r:id="rId8" w:history="1">
+        <w:r>
+          <w:rPr>
+            <w:rStyle w:val="Hyperlink"/>
+            <w:i/>
+            <w:iCs/>
+          </w:rPr>
+          <w:t>https://github.com/vitarka101/Forecast-Electricity</w:t>
+        </w:r>
+      </w:hyperlink>
     </w:p>
     <w:tbl>
       <w:tblPr>
@@ -3729,7 +3787,7 @@
                     </pic:cNvPicPr>
                   </pic:nvPicPr>
                   <pic:blipFill>
-                    <a:blip r:embed="rId7"/>
+                    <a:blip r:embed="rId9"/>
                     <a:srcRect/>
                     <a:stretch>
                       <a:fillRect/>
@@ -3945,7 +4003,7 @@
                     </pic:cNvPicPr>
                   </pic:nvPicPr>
                   <pic:blipFill>
-                    <a:blip r:embed="rId8"/>
+                    <a:blip r:embed="rId10"/>
                     <a:srcRect/>
                     <a:stretch>
                       <a:fillRect/>
@@ -5172,7 +5230,7 @@
                     </pic:cNvPicPr>
                   </pic:nvPicPr>
                   <pic:blipFill>
-                    <a:blip r:embed="rId9"/>
+                    <a:blip r:embed="rId11"/>
                     <a:srcRect/>
                     <a:stretch>
                       <a:fillRect/>
@@ -5238,7 +5296,7 @@
                     </pic:cNvPicPr>
                   </pic:nvPicPr>
                   <pic:blipFill>
-                    <a:blip r:embed="rId10"/>
+                    <a:blip r:embed="rId12"/>
                     <a:srcRect/>
                     <a:stretch>
                       <a:fillRect/>
@@ -7714,137 +7772,6 @@
                     </pic:cNvPicPr>
                   </pic:nvPicPr>
                   <pic:blipFill>
-                    <a:blip r:embed="rId11"/>
-                    <a:srcRect/>
-                    <a:stretch>
-                      <a:fillRect/>
-                    </a:stretch>
-                  </pic:blipFill>
-                  <pic:spPr bwMode="auto">
-                    <a:xfrm>
-                      <a:off x="0" y="0"/>
-                      <a:ext cx="5524500" cy="2047875"/>
-                    </a:xfrm>
-                    <a:prstGeom prst="rect">
-                      <a:avLst/>
-                    </a:prstGeom>
-                  </pic:spPr>
-                </pic:pic>
-              </a:graphicData>
-            </a:graphic>
-          </wp:inline>
-        </w:drawing>
-      </w:r>
-    </w:p>
-    <w:p>
-      <w:pPr>
-        <w:spacing w:before="60" w:after="160"/>
-        <w:jc w:val="center"/>
-      </w:pPr>
-      <w:r>
-        <w:rPr>
-          <w:i/>
-          <w:iCs/>
-          <w:color w:val="555555"/>
-          <w:sz w:val="18"/>
-          <w:szCs w:val="18"/>
-        </w:rPr>
-        <w:t>Figure 5. Top client 1 — forecasting strategy comparison.</w:t>
-      </w:r>
-    </w:p>
-    <w:p>
-      <w:pPr>
-        <w:spacing w:before="100" w:after="60"/>
-        <w:jc w:val="center"/>
-      </w:pPr>
-      <w:r>
-        <w:rPr>
-          <w:noProof/>
-        </w:rPr>
-        <w:drawing>
-          <wp:inline distT="0" distB="0" distL="0" distR="0" wp14:anchorId="0A9DF76B" wp14:editId="69296A3B">
-            <wp:extent cx="5524500" cy="2047875"/>
-            <wp:effectExtent l="0" t="0" r="0" b="0"/>
-            <wp:docPr id="741052976" name="image6.png" descr="image6.png" title="image6.png"/>
-            <wp:cNvGraphicFramePr>
-              <a:graphicFrameLocks xmlns:a="http://schemas.openxmlformats.org/drawingml/2006/main" noChangeAspect="1"/>
-            </wp:cNvGraphicFramePr>
-            <a:graphic xmlns:a="http://schemas.openxmlformats.org/drawingml/2006/main">
-              <a:graphicData uri="http://schemas.openxmlformats.org/drawingml/2006/picture">
-                <pic:pic xmlns:pic="http://schemas.openxmlformats.org/drawingml/2006/picture">
-                  <pic:nvPicPr>
-                    <pic:cNvPr id="0" name=""/>
-                    <pic:cNvPicPr>
-                      <a:picLocks noChangeAspect="1" noChangeArrowheads="1"/>
-                    </pic:cNvPicPr>
-                  </pic:nvPicPr>
-                  <pic:blipFill>
-                    <a:blip r:embed="rId12"/>
-                    <a:srcRect/>
-                    <a:stretch>
-                      <a:fillRect/>
-                    </a:stretch>
-                  </pic:blipFill>
-                  <pic:spPr bwMode="auto">
-                    <a:xfrm>
-                      <a:off x="0" y="0"/>
-                      <a:ext cx="5524500" cy="2047875"/>
-                    </a:xfrm>
-                    <a:prstGeom prst="rect">
-                      <a:avLst/>
-                    </a:prstGeom>
-                  </pic:spPr>
-                </pic:pic>
-              </a:graphicData>
-            </a:graphic>
-          </wp:inline>
-        </w:drawing>
-      </w:r>
-    </w:p>
-    <w:p>
-      <w:pPr>
-        <w:spacing w:before="60" w:after="160"/>
-        <w:jc w:val="center"/>
-      </w:pPr>
-      <w:r>
-        <w:rPr>
-          <w:i/>
-          <w:iCs/>
-          <w:color w:val="555555"/>
-          <w:sz w:val="18"/>
-          <w:szCs w:val="18"/>
-        </w:rPr>
-        <w:t>Figure 6. Top client 2 — forecasting strategy comparison.</w:t>
-      </w:r>
-    </w:p>
-    <w:p>
-      <w:pPr>
-        <w:spacing w:before="100" w:after="60"/>
-        <w:jc w:val="center"/>
-      </w:pPr>
-      <w:r>
-        <w:rPr>
-          <w:noProof/>
-        </w:rPr>
-        <w:lastRenderedPageBreak/>
-        <w:drawing>
-          <wp:inline distT="0" distB="0" distL="0" distR="0" wp14:anchorId="74DD59A2" wp14:editId="6AC493E2">
-            <wp:extent cx="5524500" cy="2047875"/>
-            <wp:effectExtent l="0" t="0" r="0" b="0"/>
-            <wp:docPr id="1746188519" name="image7.png" descr="image7.png" title="image7.png"/>
-            <wp:cNvGraphicFramePr>
-              <a:graphicFrameLocks xmlns:a="http://schemas.openxmlformats.org/drawingml/2006/main" noChangeAspect="1"/>
-            </wp:cNvGraphicFramePr>
-            <a:graphic xmlns:a="http://schemas.openxmlformats.org/drawingml/2006/main">
-              <a:graphicData uri="http://schemas.openxmlformats.org/drawingml/2006/picture">
-                <pic:pic xmlns:pic="http://schemas.openxmlformats.org/drawingml/2006/picture">
-                  <pic:nvPicPr>
-                    <pic:cNvPr id="0" name=""/>
-                    <pic:cNvPicPr>
-                      <a:picLocks noChangeAspect="1" noChangeArrowheads="1"/>
-                    </pic:cNvPicPr>
-                  </pic:nvPicPr>
-                  <pic:blipFill>
                     <a:blip r:embed="rId13"/>
                     <a:srcRect/>
                     <a:stretch>
@@ -7880,7 +7807,7 @@
           <w:sz w:val="18"/>
           <w:szCs w:val="18"/>
         </w:rPr>
-        <w:t>Figure 7. Top client 3 — forecasting strategy comparison.</w:t>
+        <w:t>Figure 5. Top client 1 — forecasting strategy comparison.</w:t>
       </w:r>
     </w:p>
     <w:p>
@@ -7893,10 +7820,10 @@
           <w:noProof/>
         </w:rPr>
         <w:drawing>
-          <wp:inline distT="0" distB="0" distL="0" distR="0" wp14:anchorId="126A44DB" wp14:editId="11E053DD">
+          <wp:inline distT="0" distB="0" distL="0" distR="0" wp14:anchorId="0A9DF76B" wp14:editId="69296A3B">
             <wp:extent cx="5524500" cy="2047875"/>
             <wp:effectExtent l="0" t="0" r="0" b="0"/>
-            <wp:docPr id="1615270424" name="image8.png" descr="image8.png" title="image8.png"/>
+            <wp:docPr id="741052976" name="image6.png" descr="image6.png" title="image6.png"/>
             <wp:cNvGraphicFramePr>
               <a:graphicFrameLocks xmlns:a="http://schemas.openxmlformats.org/drawingml/2006/main" noChangeAspect="1"/>
             </wp:cNvGraphicFramePr>
@@ -7945,7 +7872,7 @@
           <w:sz w:val="18"/>
           <w:szCs w:val="18"/>
         </w:rPr>
-        <w:t>Figure 8. Top client 4 — forecasting strategy comparison.</w:t>
+        <w:t>Figure 6. Top client 2 — forecasting strategy comparison.</w:t>
       </w:r>
     </w:p>
     <w:p>
@@ -7957,11 +7884,12 @@
         <w:rPr>
           <w:noProof/>
         </w:rPr>
+        <w:lastRenderedPageBreak/>
         <w:drawing>
-          <wp:inline distT="0" distB="0" distL="0" distR="0" wp14:anchorId="65FDF1A4" wp14:editId="5A2C0ECC">
+          <wp:inline distT="0" distB="0" distL="0" distR="0" wp14:anchorId="74DD59A2" wp14:editId="6AC493E2">
             <wp:extent cx="5524500" cy="2047875"/>
             <wp:effectExtent l="0" t="0" r="0" b="0"/>
-            <wp:docPr id="1116419370" name="image9.png" descr="image9.png" title="image9.png"/>
+            <wp:docPr id="1746188519" name="image7.png" descr="image7.png" title="image7.png"/>
             <wp:cNvGraphicFramePr>
               <a:graphicFrameLocks xmlns:a="http://schemas.openxmlformats.org/drawingml/2006/main" noChangeAspect="1"/>
             </wp:cNvGraphicFramePr>
@@ -8010,47 +7938,7 @@
           <w:sz w:val="18"/>
           <w:szCs w:val="18"/>
         </w:rPr>
-        <w:t>Figure 9. Top client 5 — forecasting strategy comparison.</w:t>
-      </w:r>
-    </w:p>
-    <w:p>
-      <w:pPr>
-        <w:pStyle w:val="Heading1"/>
-      </w:pPr>
-      <w:bookmarkStart w:id="26" w:name="_Toc228908594"/>
-      <w:r>
-        <w:t>9. Clustering Analysis</w:t>
-      </w:r>
-      <w:bookmarkEnd w:id="26"/>
-    </w:p>
-    <w:p>
-      <w:pPr>
-        <w:pStyle w:val="Heading2"/>
-      </w:pPr>
-      <w:bookmarkStart w:id="27" w:name="_Toc228908595"/>
-      <w:r>
-        <w:t>9.1 K-Means Clustering</w:t>
-      </w:r>
-      <w:bookmarkEnd w:id="27"/>
-    </w:p>
-    <w:p>
-      <w:pPr>
-        <w:spacing w:before="80" w:after="80" w:line="320" w:lineRule="auto"/>
-      </w:pPr>
-      <w:r>
-        <w:t>K-Means clustering with 4 clusters was applied to group clients by their behavioral characteristics. Clustering features included the log-transformed client mean load, log-</w:t>
-      </w:r>
-      <w:r>
-        <w:lastRenderedPageBreak/>
-        <w:t xml:space="preserve">transformed load standard deviation, and model performance features from Prophet, SARIMA, LSTM, and </w:t>
-      </w:r>
-      <w:proofErr w:type="spellStart"/>
-      <w:r>
-        <w:t>DeepAR</w:t>
-      </w:r>
-      <w:proofErr w:type="spellEnd"/>
-      <w:r>
-        <w:t>. The purpose of clustering is to enable a practical routing strategy: instead of assuming one model is best for every client, clients are grouped by load behavior and forecasting performance, and each cluster is served by its best model.</w:t>
+        <w:t>Figure 7. Top client 3 — forecasting strategy comparison.</w:t>
       </w:r>
     </w:p>
     <w:p>
@@ -8063,10 +7951,10 @@
           <w:noProof/>
         </w:rPr>
         <w:drawing>
-          <wp:inline distT="0" distB="0" distL="0" distR="0" wp14:anchorId="6740895D" wp14:editId="31E2AC26">
-            <wp:extent cx="5334000" cy="3409950"/>
+          <wp:inline distT="0" distB="0" distL="0" distR="0" wp14:anchorId="126A44DB" wp14:editId="11E053DD">
+            <wp:extent cx="5524500" cy="2047875"/>
             <wp:effectExtent l="0" t="0" r="0" b="0"/>
-            <wp:docPr id="561926078" name="image10.png" descr="image10.png" title="image10.png"/>
+            <wp:docPr id="1615270424" name="image8.png" descr="image8.png" title="image8.png"/>
             <wp:cNvGraphicFramePr>
               <a:graphicFrameLocks xmlns:a="http://schemas.openxmlformats.org/drawingml/2006/main" noChangeAspect="1"/>
             </wp:cNvGraphicFramePr>
@@ -8089,7 +7977,7 @@
                   <pic:spPr bwMode="auto">
                     <a:xfrm>
                       <a:off x="0" y="0"/>
-                      <a:ext cx="5334000" cy="3409950"/>
+                      <a:ext cx="5524500" cy="2047875"/>
                     </a:xfrm>
                     <a:prstGeom prst="rect">
                       <a:avLst/>
@@ -8115,25 +8003,7 @@
           <w:sz w:val="18"/>
           <w:szCs w:val="18"/>
         </w:rPr>
-        <w:t>Figure 10. K-means client clustering analysis.</w:t>
-      </w:r>
-    </w:p>
-    <w:p>
-      <w:pPr>
-        <w:pStyle w:val="Heading2"/>
-      </w:pPr>
-      <w:bookmarkStart w:id="28" w:name="_Toc228908596"/>
-      <w:r>
-        <w:t>9.2 Cluster Load Profiles</w:t>
-      </w:r>
-      <w:bookmarkEnd w:id="28"/>
-    </w:p>
-    <w:p>
-      <w:pPr>
-        <w:spacing w:before="80" w:after="80" w:line="320" w:lineRule="auto"/>
-      </w:pPr>
-      <w:r>
-        <w:t>The notebook visualized the distribution of load profiles by cluster, illustrating how clusters differ in terms of consumption level, volatility, and temporal pattern. The following charts provide daily load trend comparisons across clusters.</w:t>
+        <w:t>Figure 8. Top client 4 — forecasting strategy comparison.</w:t>
       </w:r>
     </w:p>
     <w:p>
@@ -8146,10 +8016,10 @@
           <w:noProof/>
         </w:rPr>
         <w:drawing>
-          <wp:inline distT="0" distB="0" distL="0" distR="0" wp14:anchorId="5FF2EED7" wp14:editId="05C1A16D">
-            <wp:extent cx="5524500" cy="2190750"/>
+          <wp:inline distT="0" distB="0" distL="0" distR="0" wp14:anchorId="65FDF1A4" wp14:editId="5A2C0ECC">
+            <wp:extent cx="5524500" cy="2047875"/>
             <wp:effectExtent l="0" t="0" r="0" b="0"/>
-            <wp:docPr id="2080610204" name="image11.png" descr="image11.png" title="image11.png"/>
+            <wp:docPr id="1116419370" name="image9.png" descr="image9.png" title="image9.png"/>
             <wp:cNvGraphicFramePr>
               <a:graphicFrameLocks xmlns:a="http://schemas.openxmlformats.org/drawingml/2006/main" noChangeAspect="1"/>
             </wp:cNvGraphicFramePr>
@@ -8172,6 +8042,194 @@
                   <pic:spPr bwMode="auto">
                     <a:xfrm>
                       <a:off x="0" y="0"/>
+                      <a:ext cx="5524500" cy="2047875"/>
+                    </a:xfrm>
+                    <a:prstGeom prst="rect">
+                      <a:avLst/>
+                    </a:prstGeom>
+                  </pic:spPr>
+                </pic:pic>
+              </a:graphicData>
+            </a:graphic>
+          </wp:inline>
+        </w:drawing>
+      </w:r>
+    </w:p>
+    <w:p>
+      <w:pPr>
+        <w:spacing w:before="60" w:after="160"/>
+        <w:jc w:val="center"/>
+      </w:pPr>
+      <w:r>
+        <w:rPr>
+          <w:i/>
+          <w:iCs/>
+          <w:color w:val="555555"/>
+          <w:sz w:val="18"/>
+          <w:szCs w:val="18"/>
+        </w:rPr>
+        <w:t>Figure 9. Top client 5 — forecasting strategy comparison.</w:t>
+      </w:r>
+    </w:p>
+    <w:p>
+      <w:pPr>
+        <w:pStyle w:val="Heading1"/>
+      </w:pPr>
+      <w:bookmarkStart w:id="26" w:name="_Toc228908594"/>
+      <w:r>
+        <w:t>9. Clustering Analysis</w:t>
+      </w:r>
+      <w:bookmarkEnd w:id="26"/>
+    </w:p>
+    <w:p>
+      <w:pPr>
+        <w:pStyle w:val="Heading2"/>
+      </w:pPr>
+      <w:bookmarkStart w:id="27" w:name="_Toc228908595"/>
+      <w:r>
+        <w:t>9.1 K-Means Clustering</w:t>
+      </w:r>
+      <w:bookmarkEnd w:id="27"/>
+    </w:p>
+    <w:p>
+      <w:pPr>
+        <w:spacing w:before="80" w:after="80" w:line="320" w:lineRule="auto"/>
+      </w:pPr>
+      <w:r>
+        <w:t>K-Means clustering with 4 clusters was applied to group clients by their behavioral characteristics. Clustering features included the log-transformed client mean load, log-</w:t>
+      </w:r>
+      <w:r>
+        <w:lastRenderedPageBreak/>
+        <w:t xml:space="preserve">transformed load standard deviation, and model performance features from Prophet, SARIMA, LSTM, and </w:t>
+      </w:r>
+      <w:proofErr w:type="spellStart"/>
+      <w:r>
+        <w:t>DeepAR</w:t>
+      </w:r>
+      <w:proofErr w:type="spellEnd"/>
+      <w:r>
+        <w:t>. The purpose of clustering is to enable a practical routing strategy: instead of assuming one model is best for every client, clients are grouped by load behavior and forecasting performance, and each cluster is served by its best model.</w:t>
+      </w:r>
+    </w:p>
+    <w:p>
+      <w:pPr>
+        <w:spacing w:before="100" w:after="60"/>
+        <w:jc w:val="center"/>
+      </w:pPr>
+      <w:r>
+        <w:rPr>
+          <w:noProof/>
+        </w:rPr>
+        <w:drawing>
+          <wp:inline distT="0" distB="0" distL="0" distR="0" wp14:anchorId="6740895D" wp14:editId="31E2AC26">
+            <wp:extent cx="5334000" cy="3409950"/>
+            <wp:effectExtent l="0" t="0" r="0" b="0"/>
+            <wp:docPr id="561926078" name="image10.png" descr="image10.png" title="image10.png"/>
+            <wp:cNvGraphicFramePr>
+              <a:graphicFrameLocks xmlns:a="http://schemas.openxmlformats.org/drawingml/2006/main" noChangeAspect="1"/>
+            </wp:cNvGraphicFramePr>
+            <a:graphic xmlns:a="http://schemas.openxmlformats.org/drawingml/2006/main">
+              <a:graphicData uri="http://schemas.openxmlformats.org/drawingml/2006/picture">
+                <pic:pic xmlns:pic="http://schemas.openxmlformats.org/drawingml/2006/picture">
+                  <pic:nvPicPr>
+                    <pic:cNvPr id="0" name=""/>
+                    <pic:cNvPicPr>
+                      <a:picLocks noChangeAspect="1" noChangeArrowheads="1"/>
+                    </pic:cNvPicPr>
+                  </pic:nvPicPr>
+                  <pic:blipFill>
+                    <a:blip r:embed="rId18"/>
+                    <a:srcRect/>
+                    <a:stretch>
+                      <a:fillRect/>
+                    </a:stretch>
+                  </pic:blipFill>
+                  <pic:spPr bwMode="auto">
+                    <a:xfrm>
+                      <a:off x="0" y="0"/>
+                      <a:ext cx="5334000" cy="3409950"/>
+                    </a:xfrm>
+                    <a:prstGeom prst="rect">
+                      <a:avLst/>
+                    </a:prstGeom>
+                  </pic:spPr>
+                </pic:pic>
+              </a:graphicData>
+            </a:graphic>
+          </wp:inline>
+        </w:drawing>
+      </w:r>
+    </w:p>
+    <w:p>
+      <w:pPr>
+        <w:spacing w:before="60" w:after="160"/>
+        <w:jc w:val="center"/>
+      </w:pPr>
+      <w:r>
+        <w:rPr>
+          <w:i/>
+          <w:iCs/>
+          <w:color w:val="555555"/>
+          <w:sz w:val="18"/>
+          <w:szCs w:val="18"/>
+        </w:rPr>
+        <w:t>Figure 10. K-means client clustering analysis.</w:t>
+      </w:r>
+    </w:p>
+    <w:p>
+      <w:pPr>
+        <w:pStyle w:val="Heading2"/>
+      </w:pPr>
+      <w:bookmarkStart w:id="28" w:name="_Toc228908596"/>
+      <w:r>
+        <w:t>9.2 Cluster Load Profiles</w:t>
+      </w:r>
+      <w:bookmarkEnd w:id="28"/>
+    </w:p>
+    <w:p>
+      <w:pPr>
+        <w:spacing w:before="80" w:after="80" w:line="320" w:lineRule="auto"/>
+      </w:pPr>
+      <w:r>
+        <w:t>The notebook visualized the distribution of load profiles by cluster, illustrating how clusters differ in terms of consumption level, volatility, and temporal pattern. The following charts provide daily load trend comparisons across clusters.</w:t>
+      </w:r>
+    </w:p>
+    <w:p>
+      <w:pPr>
+        <w:spacing w:before="100" w:after="60"/>
+        <w:jc w:val="center"/>
+      </w:pPr>
+      <w:r>
+        <w:rPr>
+          <w:noProof/>
+        </w:rPr>
+        <w:drawing>
+          <wp:inline distT="0" distB="0" distL="0" distR="0" wp14:anchorId="5FF2EED7" wp14:editId="05C1A16D">
+            <wp:extent cx="5524500" cy="2190750"/>
+            <wp:effectExtent l="0" t="0" r="0" b="0"/>
+            <wp:docPr id="2080610204" name="image11.png" descr="image11.png" title="image11.png"/>
+            <wp:cNvGraphicFramePr>
+              <a:graphicFrameLocks xmlns:a="http://schemas.openxmlformats.org/drawingml/2006/main" noChangeAspect="1"/>
+            </wp:cNvGraphicFramePr>
+            <a:graphic xmlns:a="http://schemas.openxmlformats.org/drawingml/2006/main">
+              <a:graphicData uri="http://schemas.openxmlformats.org/drawingml/2006/picture">
+                <pic:pic xmlns:pic="http://schemas.openxmlformats.org/drawingml/2006/picture">
+                  <pic:nvPicPr>
+                    <pic:cNvPr id="0" name=""/>
+                    <pic:cNvPicPr>
+                      <a:picLocks noChangeAspect="1" noChangeArrowheads="1"/>
+                    </pic:cNvPicPr>
+                  </pic:nvPicPr>
+                  <pic:blipFill>
+                    <a:blip r:embed="rId19"/>
+                    <a:srcRect/>
+                    <a:stretch>
+                      <a:fillRect/>
+                    </a:stretch>
+                  </pic:blipFill>
+                  <pic:spPr bwMode="auto">
+                    <a:xfrm>
+                      <a:off x="0" y="0"/>
                       <a:ext cx="5524500" cy="2190750"/>
                     </a:xfrm>
                     <a:prstGeom prst="rect">
@@ -8229,7 +8287,7 @@
                     </pic:cNvPicPr>
                   </pic:nvPicPr>
                   <pic:blipFill>
-                    <a:blip r:embed="rId18"/>
+                    <a:blip r:embed="rId20"/>
                     <a:srcRect/>
                     <a:stretch>
                       <a:fillRect/>
@@ -8294,7 +8352,7 @@
                     </pic:cNvPicPr>
                   </pic:nvPicPr>
                   <pic:blipFill>
-                    <a:blip r:embed="rId19"/>
+                    <a:blip r:embed="rId21"/>
                     <a:srcRect/>
                     <a:stretch>
                       <a:fillRect/>
@@ -8417,7 +8475,7 @@
                     </pic:cNvPicPr>
                   </pic:nvPicPr>
                   <pic:blipFill>
-                    <a:blip r:embed="rId20"/>
+                    <a:blip r:embed="rId22"/>
                     <a:srcRect/>
                     <a:stretch>
                       <a:fillRect/>
@@ -8500,7 +8558,7 @@
                     </pic:cNvPicPr>
                   </pic:nvPicPr>
                   <pic:blipFill>
-                    <a:blip r:embed="rId21"/>
+                    <a:blip r:embed="rId23"/>
                     <a:srcRect/>
                     <a:stretch>
                       <a:fillRect/>
@@ -10054,7 +10112,7 @@
                     </pic:cNvPicPr>
                   </pic:nvPicPr>
                   <pic:blipFill>
-                    <a:blip r:embed="rId22"/>
+                    <a:blip r:embed="rId24"/>
                     <a:srcRect/>
                     <a:stretch>
                       <a:fillRect/>
@@ -10119,7 +10177,7 @@
                     </pic:cNvPicPr>
                   </pic:nvPicPr>
                   <pic:blipFill>
-                    <a:blip r:embed="rId23"/>
+                    <a:blip r:embed="rId25"/>
                     <a:srcRect/>
                     <a:stretch>
                       <a:fillRect/>
@@ -10185,7 +10243,7 @@
                     </pic:cNvPicPr>
                   </pic:nvPicPr>
                   <pic:blipFill>
-                    <a:blip r:embed="rId24"/>
+                    <a:blip r:embed="rId26"/>
                     <a:srcRect/>
                     <a:stretch>
                       <a:fillRect/>
@@ -16362,8 +16420,8 @@
       </w:pPr>
     </w:p>
     <w:sectPr>
-      <w:headerReference w:type="default" r:id="rId25"/>
-      <w:footerReference w:type="default" r:id="rId26"/>
+      <w:headerReference w:type="default" r:id="rId27"/>
+      <w:footerReference w:type="default" r:id="rId28"/>
       <w:pgSz w:w="12240" w:h="15840"/>
       <w:pgMar w:top="1440" w:right="1440" w:bottom="1440" w:left="1440" w:header="708" w:footer="708" w:gutter="0"/>
       <w:cols w:space="720"/>
@@ -17782,6 +17840,18 @@
       <w:szCs w:val="24"/>
     </w:rPr>
   </w:style>
+  <w:style w:type="character" w:styleId="UnresolvedMention">
+    <w:name w:val="Unresolved Mention"/>
+    <w:basedOn w:val="DefaultParagraphFont"/>
+    <w:uiPriority w:val="99"/>
+    <w:semiHidden/>
+    <w:unhideWhenUsed/>
+    <w:rsid w:val="00813DC8"/>
+    <w:rPr>
+      <w:color w:val="605E5C"/>
+      <w:shd w:val="clear" w:color="auto" w:fill="E1DFDD"/>
+    </w:rPr>
+  </w:style>
 </w:styles>
 </file>
 

</xml_diff>